<commit_message>
Remove Dissociated Alter from Block 3 in executive presentation slide
</commit_message>
<xml_diff>
--- a/docs/The_6th_Axiom_Executive_Slide_Thomas_Riebl_A4_Landscape.docx
+++ b/docs/The_6th_Axiom_Executive_Slide_Thomas_Riebl_A4_Landscape.docx
@@ -1266,10 +1266,29 @@
         <w:t xml:space="preserve"> </w:t>
       </w:r>
       <w:r>
-        <w:t xml:space="preserve">Consciousness exists only at the spatiotemporal grain where integrated cause-effect power</w:t>
-      </w:r>
-      <w:r>
-        <w:t xml:space="preserve"> </w:t>
+        <w:t xml:space="preserve">Consciousness exists only at the spatiotemporal grain where integrated cause-effect power reaches a local maximum.</w:t>
+      </w:r>
+      <w:r>
+        <w:t xml:space="preserve"> </w:t>
+      </w:r>
+      <w:r>
+        <w:t xml:space="preserve">*</w:t>
+      </w:r>
+      <w:r>
+        <w:t xml:space="preserve"> </w:t>
+      </w:r>
+      <w:r>
+        <w:rPr>
+          <w:b/>
+          <w:bCs/>
+        </w:rPr>
+        <w:t xml:space="preserve">Causal Irreducibility:</w:t>
+      </w:r>
+      <w:r>
+        <w:t xml:space="preserve"> </w:t>
+      </w:r>
+      <w:r>
+        <w:t xml:space="preserve">A system is conscious if and only if its whole exerts causal power over itself above and beyond its independent parts (</w:t>
       </w:r>
       <m:oMath>
         <m:r>
@@ -1278,51 +1297,18 @@
           </m:rPr>
           <m:t>Φ</m:t>
         </m:r>
+        <m:r>
+          <m:rPr>
+            <m:sty m:val="p"/>
+          </m:rPr>
+          <m:t>&gt;</m:t>
+        </m:r>
+        <m:r>
+          <m:t>0</m:t>
+        </m:r>
       </m:oMath>
       <w:r>
-        <w:t xml:space="preserve"> </w:t>
-      </w:r>
-      <w:r>
-        <w:t xml:space="preserve">reaches a local maximum.</w:t>
-      </w:r>
-      <w:r>
-        <w:t xml:space="preserve"> </w:t>
-      </w:r>
-      <w:r>
-        <w:t xml:space="preserve">*</w:t>
-      </w:r>
-      <w:r>
-        <w:t xml:space="preserve"> </w:t>
-      </w:r>
-      <w:r>
-        <w:rPr>
-          <w:b/>
-          <w:bCs/>
-        </w:rPr>
-        <w:t xml:space="preserve">The Dissociated Alter:</w:t>
-      </w:r>
-      <w:r>
-        <w:t xml:space="preserve"> </w:t>
-      </w:r>
-      <w:r>
-        <w:t xml:space="preserve">A localized whirlpool in Mind-at-Large whose internal</w:t>
-      </w:r>
-      <w:r>
-        <w:t xml:space="preserve"> </w:t>
-      </w:r>
-      <m:oMath>
-        <m:r>
-          <m:rPr>
-            <m:sty m:val="p"/>
-          </m:rPr>
-          <m:t>Φ</m:t>
-        </m:r>
-      </m:oMath>
-      <w:r>
-        <w:t xml:space="preserve"> </w:t>
-      </w:r>
-      <w:r>
-        <w:t xml:space="preserve">is decoupled from external states by the Markov Blanket.</w:t>
+        <w:t xml:space="preserve">).</w:t>
       </w:r>
     </w:p>
     <w:p>

</xml_diff>